<commit_message>
Validate Phase 1 H1-2 asset
</commit_message>
<xml_diff>
--- a/H1-2_FYP_Project_Context.docx
+++ b/H1-2_FYP_Project_Context.docx
@@ -20,7 +20,7 @@
     </w:p>
     <w:p>
       <w:r>
-        <w:t>Version: v1.1</w:t>
+        <w:t>Version: v1.3</w:t>
       </w:r>
     </w:p>
     <w:p>
@@ -1729,7 +1729,7 @@
         <w:pStyle w:val="ListBullet"/>
       </w:pPr>
       <w:r>
-        <w:t>Phase 0 is complete: experiment_spec.md v1.0 freezes the standing, right-arm 3D-reaching task, B0-B4 comparison, 21-DoF non-wrist action contract, Advantage Mixing rule, success contract, and formal evaluation protocol.</w:t>
+        <w:t>Phase 0 is complete and committed to the FYP GitHub branch codex/phase-0-experiment-spec as commit 33f9ad1. The branch contains experiment_spec.md and this project-context document.</w:t>
       </w:r>
     </w:p>
     <w:p>
@@ -1737,7 +1737,7 @@
         <w:pStyle w:val="ListBullet"/>
       </w:pPr>
       <w:r>
-        <w:t>The supplied project-context document and four supplied papers were read; repository configurations and existing H1 task interfaces were inspected before writing the specification.</w:t>
+        <w:t>Phase 1 asset validation is complete. The official Unitree H1-2 description was retrieved from unitree_ros commit ccfc6fd8430a17ba3dacef9a1e2faf64ff3b0aee under its BSD-3-Clause license; provenance and validation evidence are recorded in assets/h1_2/.</w:t>
       </w:r>
     </w:p>
     <w:p>
@@ -1745,7 +1745,7 @@
         <w:pStyle w:val="ListBullet"/>
       </w:pPr>
       <w:r>
-        <w:t>Repository inspection found only a Nucleus-referenced H1/H1_MINIMAL_CFG and existing H1 locomotion examples. They are reference interfaces, not evidence of a validated H1-2 standing-reaching environment.</w:t>
+        <w:t>The official h1_2_handless.urdf has 32 links and 27 actuated joints. Removing left and right wrist roll, pitch, and yaw leaves the frozen 21-joint policy interface in asset_manifest.json.</w:t>
       </w:r>
     </w:p>
     <w:p>
@@ -1753,7 +1753,7 @@
         <w:pStyle w:val="ListBullet"/>
       </w:pPr>
       <w:r>
-        <w:t>The H1-2 dynamic-balance paper records 27 DoF and 21 controlled non-wrist DoF. The exact H1-2 asset, joint map, real-interface correspondence, and physical parameters remain unvalidated.</w:t>
+        <w:t>The static validator passed: pelvis is the sole root link; all 27 actuated joints have limits; candidate ankle support links and the right wrist-yaw end-effector link exist; the URDF SHA-256 is recorded.</w:t>
       </w:r>
     </w:p>
     <w:p>
@@ -1761,12 +1761,12 @@
         <w:pStyle w:val="ListBullet"/>
       </w:pPr>
       <w:r>
-        <w:t>No task, reward, PPO, or simulation code was added or changed. The pre-existing uv.lock modification was preserved.</w:t>
+        <w:t>Runtime validation passed on an RTX 4060 host with driver 595.84: PyTorch CUDA is available, and the official handless MJCF loaded and stepped for 1.0 s at 0.002 s timestep in MuJoCo with finite state, 27 actuators, 21 policy actuators, and eight contacts after stepping.</w:t>
       </w:r>
     </w:p>
     <w:p>
       <w:r>
-        <w:t>The next phase is asset and environment validation; no B1-B4 training may begin until its interface manifest and smoke test are recorded.</w:t>
+        <w:t>Isaac Lab standalone importers converted both the official MJCF and a fixed-base URDF to temporary USD assets. The fixed-base USD has 27 revolute joints, 21 policy joints, a pelvis articulation root, and two fixed joints. Phase 2 is to build the one-environment standing task with explicit drives and a zero-action rollout.</w:t>
       </w:r>
     </w:p>
     <w:p>
@@ -1789,7 +1789,7 @@
         <w:pStyle w:val="ListBullet"/>
       </w:pPr>
       <w:r>
-        <w:t>The frozen core task is bilateral standing with position-only right-arm reaching; walking, grasping, perception, wrist control, and Sim-to-Real are out of scope for the core comparison.</w:t>
+        <w:t>The frozen core task and B0-B4 protocol remain unchanged. Phase 1 now validates the official asset boundary and the 21-action non-wrist interface in static files, direct dynamics, and converted USD.</w:t>
       </w:r>
     </w:p>
     <w:p>
@@ -1797,7 +1797,7 @@
         <w:pStyle w:val="ListBullet"/>
       </w:pPr>
       <w:r>
-        <w:t>The frozen comparison is B0 standing IK+PD, B1 vanilla unified PPO, B2 PPO plus linear Advantage Mixing, B3 B2 plus CoM reward, and B4 B2 plus ZMP reward.</w:t>
+        <w:t>The official source is Unitree unitree_ros commit ccfc6fd8430a17ba3dacef9a1e2faf64ff3b0aee, robots/h1_2_description; it is BSD-3-Clause licensed and its 80 MiB description directory is not vendored.</w:t>
       </w:r>
     </w:p>
     <w:p>
@@ -1805,7 +1805,7 @@
         <w:pStyle w:val="ListBullet"/>
       </w:pPr>
       <w:r>
-        <w:t>The frozen learned-policy contract is a 21-dimensional non-wrist joint-position-offset action at 50 Hz over 200 Hz physics, pending verification that the real H1-2 asset realizes that mapping.</w:t>
+        <w:t>The official handless URDF has 27 actuated joints: 12 leg joints, torso, 8 shoulder/elbow joints, and 6 wrist joints. The policy order excludes exactly the six wrist joints.</w:t>
       </w:r>
     </w:p>
     <w:p>
@@ -1813,7 +1813,7 @@
         <w:pStyle w:val="ListBullet"/>
       </w:pPr>
       <w:r>
-        <w:t>All learned groups must share interfaces, network capacity, training budget, randomization schedule, checkpoint rule, and evaluation suite; formal reporting uses five seeds and 100 fresh episodes per seed per scenario.</w:t>
+        <w:t>The converted fixed-base USD preserves 27 revolute joints, 21 policy joints, and a pelvis articulation root. Direct MuJoCo stepping confirms a finite 1.0 s state and contact generation, but it does not validate Isaac Lab PD control behavior.</w:t>
       </w:r>
     </w:p>
     <w:p>
@@ -1821,7 +1821,7 @@
         <w:pStyle w:val="ListBullet"/>
       </w:pPr>
       <w:r>
-        <w:t>The current Isaac Lab H1 configuration uses an external H1 USD path and its velocity task is not the FYP task. Its action and timing conventions are reusable only after H1-2 asset validation.</w:t>
+        <w:t>The FYP repository has a remote-tracking Phase 0 branch. The official H1-2 source can be reproducibly fetched with sparse Git checkout and checked by tools/validate_h1_2_description.py; Phase 1 evidence is recorded under assets/h1_2/.</w:t>
       </w:r>
     </w:p>
     <w:p>
@@ -1844,7 +1844,7 @@
         <w:pStyle w:val="ListBullet"/>
       </w:pPr>
       <w:r>
-        <w:t>Exact H1-2 USD/URDF source and checksum; 27 joint names, limits, masses/inertias, 21 controlled indices, wrist indices, body names, end-effector frame, and real-robot correspondence.</w:t>
+        <w:t>The current .venv was created before UV_PYTHON_INSTALL_DIR was redirected to the FYP SSD, so uv --no-sync reports an interpreter-preference warning. Recreate or migrate the managed Python environment before long training runs.</w:t>
       </w:r>
     </w:p>
     <w:p>
@@ -1852,7 +1852,7 @@
         <w:pStyle w:val="ListBullet"/>
       </w:pPr>
       <w:r>
-        <w:t>A runnable Isaac Lab environment: uv run isaaclab -f could not complete because the environment could not resolve/download cuda-bindings; the command also rebuilt the ignored local .venv.</w:t>
+        <w:t>The converted MJCF USD warns that source motor declarations do not create usable physics-drive stiffness or damping. Phase 2 must define, document, and validate PD drives rather than relying on importer defaults.</w:t>
       </w:r>
     </w:p>
     <w:p>
@@ -1860,7 +1860,7 @@
         <w:pStyle w:val="ListBullet"/>
       </w:pPr>
       <w:r>
-        <w:t>Exact collision-free, IK-reachable target set and base-frame convention for right-arm targets.</w:t>
+        <w:t>Candidate foot-contact bodies and the right end-effector frame are identified structurally but must be checked in the actual Isaac Lab articulation and task scene after explicit drive configuration.</w:t>
       </w:r>
     </w:p>
     <w:p>
@@ -1868,7 +1868,7 @@
         <w:pStyle w:val="ListBullet"/>
       </w:pPr>
       <w:r>
-        <w:t>Asset-derived PD gains, action scales, nominal pose, torque/velocity limits, contact thresholds, and fall/posture limits.</w:t>
+        <w:t>Actual PD gains, action scales, nominal standing pose, torque/velocity limits, contact thresholds, and fall/posture limits remain unselected.</w:t>
       </w:r>
     </w:p>
     <w:p>
@@ -1876,7 +1876,7 @@
         <w:pStyle w:val="ListBullet"/>
       </w:pPr>
       <w:r>
-        <w:t>Exact CoM support-margin and force/moment-based ZMP implementation and their static-standing, arm-motion, push, and foot-lift tests.</w:t>
+        <w:t>Exact CoM support-margin and force/moment-based ZMP implementation and their static-standing, arm-motion, push, and foot-lift tests remain unimplemented.</w:t>
       </w:r>
     </w:p>
     <w:p>
@@ -1884,7 +1884,7 @@
         <w:pStyle w:val="ListBullet"/>
       </w:pPr>
       <w:r>
-        <w:t>Total environment-step budget, available GPU, number of parallel environments, and the committed configuration values for payload, push, delay, friction, mass/CoM, gain, and noise ranges.</w:t>
+        <w:t>Total environment-step budget, available GPU memory, number of parallel environments, and committed configuration values for randomization ranges remain unselected.</w:t>
       </w:r>
     </w:p>
     <w:p>
@@ -1892,7 +1892,7 @@
         <w:pStyle w:val="ListBullet"/>
       </w:pPr>
       <w:r>
-        <w:t>Selected PPO/RSL-RL implementation details for grouped log probabilities, separate return/GAE computation, normalization, clipping, and critic heads for Advantage Mixing.</w:t>
+        <w:t>Selected PPO/RSL-RL implementation details for grouped log probabilities, separate return/GAE computation, normalization, clipping, and critic heads for Advantage Mixing remain unselected.</w:t>
       </w:r>
     </w:p>
     <w:p>
@@ -1900,7 +1900,7 @@
         <w:pStyle w:val="ListBullet"/>
       </w:pPr>
       <w:r>
-        <w:t>Whether the desired H1-2 asset can be legally obtained and stored/referenced in the project without substituting the existing H1 asset.</w:t>
+        <w:t>Whether a later Sim-to-Real implementation requires a separate real-robot SDK or interface agreement beyond the public description files remains open.</w:t>
       </w:r>
     </w:p>
     <w:p>
@@ -1908,7 +1908,7 @@
         <w:pStyle w:val="ListBullet"/>
       </w:pPr>
       <w:r>
-        <w:t>The Git remote is the upstream IsaacLab repository; a personal/fork remote and push authority are needed before this project work can be pushed to GitHub.</w:t>
+        <w:t>Phase 1 asset-validation evidence is committed on the codex/phase-1-asset-validation branch. Phase 2 must pass reset and zero-action standing tests before any PPO or target-reaching implementation is started.</w:t>
       </w:r>
     </w:p>
     <w:p>
@@ -1936,12 +1936,12 @@
     </w:p>
     <w:p>
       <w:r>
-        <w:t>Phase 1: create and run a narrow H1-2 asset-validation and standing smoke-test plan. It must resolve the H1-2 asset, emit an immutable robot/interface manifest, instantiate the 21-action standing configuration, and verify reset, joint ordering/limits, contacts, end-effector frame, and one control step without a fall.</w:t>
+        <w:t>Phase 2: create a one-environment, fixed-base H1-2 standing task using the pinned asset. Explicitly configure all 27 drives, hold the six excluded wrists at nominal targets, apply the frozen 21-action map, and verify reset plus a zero-action rollout.</w:t>
       </w:r>
     </w:p>
     <w:p>
       <w:r>
-        <w:t>Phase 1 acceptance criteria: asset checksum and source, joint/action map, physical/contact names, timing/PD parameters, and a passing reproducible smoke-test log are committed; asset-validation gates in experiment_spec.md are filled without changing the frozen protocol.</w:t>
+        <w:t>Phase 2 completion criteria: reproducible GPU logs for reset and zero-action stepping; loaded articulation joint names/order and action mapping match asset_manifest.json; no NaN, drive-resolution, or contact-name error; PD and nominal-pose parameters are committed without changing experiment_spec.md.</w:t>
       </w:r>
     </w:p>
     <w:p>

</xml_diff>

<commit_message>
Complete Phase 2 and Phase 3 validation
</commit_message>
<xml_diff>
--- a/H1-2_FYP_Project_Context.docx
+++ b/H1-2_FYP_Project_Context.docx
@@ -20,7 +20,7 @@
     </w:p>
     <w:p>
       <w:r>
-        <w:t>Version: v1.3</w:t>
+        <w:t>Version: v1.7</w:t>
       </w:r>
     </w:p>
     <w:p>
@@ -1721,7 +1721,7 @@
     </w:p>
     <w:p>
       <w:r>
-        <w:t>As of 2026-09-20:</w:t>
+        <w:t>Phase 0 experiment specification remains frozen. No PPO, reward, CoM/ZMP diagnostic, or trainable environment has been added. Phases 1 and 2 produced an import and standing-validation baseline; they are not yet complete against the full original Phase 2 acceptance checklist.</w:t>
       </w:r>
     </w:p>
     <w:p>
@@ -1729,7 +1729,7 @@
         <w:pStyle w:val="ListBullet"/>
       </w:pPr>
       <w:r>
-        <w:t>Phase 0 is complete and committed to the FYP GitHub branch codex/phase-0-experiment-spec as commit 33f9ad1. The branch contains experiment_spec.md and this project-context document.</w:t>
+        <w:t>Phase 1 is complete in /media/zlc/FYP/IsaacLab: the official Unitree H1-2 description is pinned by source commit and SHA-256, and static plus MuJoCo validation passed.</w:t>
       </w:r>
     </w:p>
     <w:p>
@@ -1737,7 +1737,7 @@
         <w:pStyle w:val="ListBullet"/>
       </w:pPr>
       <w:r>
-        <w:t>Phase 1 asset validation is complete. The official Unitree H1-2 description was retrieved from unitree_ros commit ccfc6fd8430a17ba3dacef9a1e2faf64ff3b0aee under its BSD-3-Clause license; provenance and validation evidence are recorded in assets/h1_2/.</w:t>
+        <w:t>Phase 2 implementation is complete in /media/zlc/FYP/IsaacLab: fixed-base H1-2 configuration, 21-action interface, six fixed wrist targets, nominal pose, headless zero-action rollout, and a visible GUI smoke rollout are maintained in h1_whole_body_reaching/.</w:t>
       </w:r>
     </w:p>
     <w:p>
@@ -1745,7 +1745,7 @@
         <w:pStyle w:val="ListBullet"/>
       </w:pPr>
       <w:r>
-        <w:t>The official h1_2_handless.urdf has 32 links and 27 actuated joints. Removing left and right wrist roll, pitch, and yaw leaves the frozen 21-joint policy interface in asset_manifest.json.</w:t>
+        <w:t>The 200-step Isaac Sim 6.1 zero-action rollout passed on the RTX 4060 Laptop GPU: 1.0 s simulated, finite state, and maximum nominal-pose error 0.046060919761657715 rad. A visible GUI smoke rollout also passed through NVIDIA PRIME render offload: 20 steps, 0.1 s simulated, finite state, and maximum nominal-pose error 0.02624887228012085 rad. The scene displayed and shut down normally.</w:t>
       </w:r>
     </w:p>
     <w:p>
@@ -1753,20 +1753,7 @@
         <w:pStyle w:val="ListBullet"/>
       </w:pPr>
       <w:r>
-        <w:t>The static validator passed: pelvis is the sole root link; all 27 actuated joints have limits; candidate ankle support links and the right wrist-yaw end-effector link exist; the URDF SHA-256 is recorded.</w:t>
-      </w:r>
-    </w:p>
-    <w:p>
-      <w:pPr>
-        <w:pStyle w:val="ListBullet"/>
-      </w:pPr>
-      <w:r>
-        <w:t>Runtime validation passed on an RTX 4060 host with driver 595.84: PyTorch CUDA is available, and the official handless MJCF loaded and stepped for 1.0 s at 0.002 s timestep in MuJoCo with finite state, 27 actuators, 21 policy actuators, and eight contacts after stepping.</w:t>
-      </w:r>
-    </w:p>
-    <w:p>
-      <w:r>
-        <w:t>Isaac Lab standalone importers converted both the official MJCF and a fixed-base URDF to temporary USD assets. The fixed-base USD has 27 revolute joints, 21 policy joints, a pelvis articulation root, and two fixed joints. Phase 2 is to build the one-environment standing task with explicit drives and a zero-action rollout.</w:t>
+        <w:t>Phase 3 has a validated fixed-target prototype, not a complete task environment. It has a fixed right-wrist target at (0.0843, -0.2163, 0.9938) m, a six-value position-and-error observation, action scale 0.1 rad, success/timeout/non-finite/hard-limit terminations, and deterministic policy-joint reset offsets in [-0.01, 0.01] rad. The scripted action reduced target error from 0.018443127032526485 m to 0.001063834419551235 m. Manual GUI review confirmed the red target sphere was near the right wrist and the pose and both feet were normal. Four headless reset seeds (7–10) passed with finite state and no limit or timeout termination.</w:t>
       </w:r>
     </w:p>
     <w:p>
@@ -1789,7 +1776,7 @@
         <w:pStyle w:val="ListBullet"/>
       </w:pPr>
       <w:r>
-        <w:t>The frozen core task and B0-B4 protocol remain unchanged. Phase 1 now validates the official asset boundary and the 21-action non-wrist interface in static files, direct dynamics, and converted USD.</w:t>
+        <w:t>Official source is unitreerobotics/unitree_ros commit ccfc6fd8430a17ba3dacef9a1e2faf64ff3b0aee, robots/h1_2_description, BSD-3-Clause.</w:t>
       </w:r>
     </w:p>
     <w:p>
@@ -1797,7 +1784,7 @@
         <w:pStyle w:val="ListBullet"/>
       </w:pPr>
       <w:r>
-        <w:t>The official source is Unitree unitree_ros commit ccfc6fd8430a17ba3dacef9a1e2faf64ff3b0aee, robots/h1_2_description; it is BSD-3-Clause licensed and its 80 MiB description directory is not vendored.</w:t>
+        <w:t>The handless URDF has 32 links, pelvis as root, 27 actuated joints, valid limits, and the frozen 21-joint policy order. Six wrist joints are excluded from policy control.</w:t>
       </w:r>
     </w:p>
     <w:p>
@@ -1805,7 +1792,7 @@
         <w:pStyle w:val="ListBullet"/>
       </w:pPr>
       <w:r>
-        <w:t>The official handless URDF has 27 actuated joints: 12 leg joints, torso, 8 shoulder/elbow joints, and 6 wrist joints. The policy order excludes exactly the six wrist joints.</w:t>
+        <w:t>The direct MuJoCo smoke test ran for 1.0 s at 0.002 s timestep with finite state, 27 actuators, 21 policy actuators, and eight diagnostic contacts after stepping.</w:t>
       </w:r>
     </w:p>
     <w:p>
@@ -1813,7 +1800,7 @@
         <w:pStyle w:val="ListBullet"/>
       </w:pPr>
       <w:r>
-        <w:t>The converted fixed-base USD preserves 27 revolute joints, 21 policy joints, and a pelvis articulation root. Direct MuJoCo stepping confirms a finite 1.0 s state and contact generation, but it does not validate Isaac Lab PD control behavior.</w:t>
+        <w:t>Phase 2 controller contract is dt 0.005 s, decimation 4, 50 Hz nominal control, normalized action scale 0.1 rad, fixed pelvis, and 0 rad wrist targets.</w:t>
       </w:r>
     </w:p>
     <w:p>
@@ -1821,7 +1808,7 @@
         <w:pStyle w:val="ListBullet"/>
       </w:pPr>
       <w:r>
-        <w:t>The FYP repository has a remote-tracking Phase 0 branch. The official H1-2 source can be reproducibly fetched with sparse Git checkout and checked by tools/validate_h1_2_description.py; Phase 1 evidence is recorded under assets/h1_2/.</w:t>
+        <w:t>Nine focused interface tests passed, together with static validation, a MuJoCo smoke test, zero-action Isaac Sim rollout, fixed-target Isaac Sim rollout, and four reset seeds. These are baseline evidence rather than proof of the full Phase 2 or Phase 3 checklists. The Kit startup stall was caused by a dangling ~/.cache/ov link to an unavailable external drive; replacing it with a local directory allowed the H1-2 rollout to start normally. A later GUI hang was traced to an nvidia_uvm order-9 allocation failure on a 16 GiB system with no swap; a persistent 16 GiB /swapfile resolved that resource condition.</w:t>
       </w:r>
     </w:p>
     <w:p>
@@ -1844,7 +1831,7 @@
         <w:pStyle w:val="ListBullet"/>
       </w:pPr>
       <w:r>
-        <w:t>The current .venv was created before UV_PYTHON_INSTALL_DIR was redirected to the FYP SSD, so uv --no-sync reports an interpreter-preference warning. Recreate or migrate the managed Python environment before long training runs.</w:t>
+        <w:t>Phase 2 is not yet closed against its original checklist: there is no independent per-joint small-amplitude direction test, no systematic left-right symmetry test, no independent forward-kinematics versus simulator end-effector comparison, and no CoM/ZMP standing analysis. Collision geometry, mass, centre of mass, and inertia also lack systematic validation; Isaac Sim still reports a non-blocking `logo_link` inertia warning.</w:t>
       </w:r>
     </w:p>
     <w:p>
@@ -1852,7 +1839,7 @@
         <w:pStyle w:val="ListBullet"/>
       </w:pPr>
       <w:r>
-        <w:t>The converted MJCF USD warns that source motor declarations do not create usable physics-drive stiffness or damping. Phase 2 must define, document, and validate PD drives rather than relying on importer defaults.</w:t>
+        <w:t>Phase 3 is not yet a complete episode environment: target generation is fixed rather than sampled from a safe 3D reachable workspace; no formal registered reset-step-termination loop exists; there is no reward or metric calculation, multi-environment execution, or complete observation range/unit validation. Fall and contact termination are intentionally absent because the pelvis is fixed, so they must not be claimed as complete.</w:t>
       </w:r>
     </w:p>
     <w:p>
@@ -1860,7 +1847,7 @@
         <w:pStyle w:val="ListBullet"/>
       </w:pPr>
       <w:r>
-        <w:t>Candidate foot-contact bodies and the right end-effector frame are identified structurally but must be checked in the actual Isaac Lab articulation and task scene after explicit drive configuration.</w:t>
+        <w:t>PD gains are conservative Phase 2 engineering values, not yet tuned from runtime behavior; standing stability and target tracking under disturbances must be demonstrated before PPO. The FYP GitHub branches are a minimal overlay whereas this workspace is a full IsaacLab checkout. Decide and document the intended project repository layout before pushing or merging changes.</w:t>
       </w:r>
     </w:p>
     <w:p>
@@ -1868,55 +1855,7 @@
         <w:pStyle w:val="ListBullet"/>
       </w:pPr>
       <w:r>
-        <w:t>Actual PD gains, action scales, nominal standing pose, torque/velocity limits, contact thresholds, and fall/posture limits remain unselected.</w:t>
-      </w:r>
-    </w:p>
-    <w:p>
-      <w:pPr>
-        <w:pStyle w:val="ListBullet"/>
-      </w:pPr>
-      <w:r>
-        <w:t>Exact CoM support-margin and force/moment-based ZMP implementation and their static-standing, arm-motion, push, and foot-lift tests remain unimplemented.</w:t>
-      </w:r>
-    </w:p>
-    <w:p>
-      <w:pPr>
-        <w:pStyle w:val="ListBullet"/>
-      </w:pPr>
-      <w:r>
-        <w:t>Total environment-step budget, available GPU memory, number of parallel environments, and committed configuration values for randomization ranges remain unselected.</w:t>
-      </w:r>
-    </w:p>
-    <w:p>
-      <w:pPr>
-        <w:pStyle w:val="ListBullet"/>
-      </w:pPr>
-      <w:r>
-        <w:t>Selected PPO/RSL-RL implementation details for grouped log probabilities, separate return/GAE computation, normalization, clipping, and critic heads for Advantage Mixing remain unselected.</w:t>
-      </w:r>
-    </w:p>
-    <w:p>
-      <w:pPr>
-        <w:pStyle w:val="ListBullet"/>
-      </w:pPr>
-      <w:r>
-        <w:t>Whether a later Sim-to-Real implementation requires a separate real-robot SDK or interface agreement beyond the public description files remains open.</w:t>
-      </w:r>
-    </w:p>
-    <w:p>
-      <w:pPr>
-        <w:pStyle w:val="ListBullet"/>
-      </w:pPr>
-      <w:r>
-        <w:t>Phase 1 asset-validation evidence is committed on the codex/phase-1-asset-validation branch. Phase 2 must pass reset and zero-action standing tests before any PPO or target-reaching implementation is started.</w:t>
-      </w:r>
-    </w:p>
-    <w:p>
-      <w:pPr>
-        <w:pStyle w:val="ListBullet"/>
-      </w:pPr>
-      <w:r>
-        <w:t>No unresolved item may be resolved by silently changing experiment_spec.md; changes require the documented change-control process.</w:t>
+        <w:t>Target randomization, rewards, CoM/ZMP diagnostics, PPO, and Advantage Mixing remain intentionally unimplemented. The current reset, fixed target, observation, action, and termination code is a bounded prototype contract, not a trainable task environment.</w:t>
       </w:r>
     </w:p>
     <w:p>
@@ -1936,12 +1875,12 @@
     </w:p>
     <w:p>
       <w:r>
-        <w:t>Phase 2: create a one-environment, fixed-base H1-2 standing task using the pinned asset. Explicitly configure all 27 drives, hold the six excluded wrists at nominal targets, apply the frozen 21-action map, and verify reset plus a zero-action rollout.</w:t>
+        <w:t>First close the Phase 2 evidence gaps with independently testable per-joint direction and symmetry probes, FK-versus-simulator end-effector comparison, collision/mass/inertia review, and a documented static CoM/ZMP analysis. Do not claim full Phase 2 completion before those results are recorded.</w:t>
       </w:r>
     </w:p>
     <w:p>
       <w:r>
-        <w:t>Phase 2 completion criteria: reproducible GPU logs for reset and zero-action stepping; loaded articulation joint names/order and action mapping match asset_manifest.json; no NaN, drive-resolution, or contact-name error; PD and nominal-pose parameters are committed without changing experiment_spec.md.</w:t>
+        <w:t>Then complete Phase 3 by implementing a registered reaching environment that repeatedly resets, samples safe 3D targets, steps, observes, applies action scaling, computes a minimal separately tested reaching reward, and supports vectorized execution. Add fall/contact termination only after moving from fixed-base to free-base; do not add PPO or Advantage Mixing before these contracts have independent tests.</w:t>
       </w:r>
     </w:p>
     <w:p>

</xml_diff>